<commit_message>
fix(legal): set Dmitry's real INN 731303201073 and clean legal status across offer, privacy, and billing documents
</commit_message>
<xml_diff>
--- a/billing/Акт_01-2026_ТД_Автожидкости.docx
+++ b/billing/Акт_01-2026_ТД_Автожидкости.docx
@@ -11,7 +11,7 @@
           <w:b/>
           <w:sz w:val="28"/>
         </w:rPr>
-        <w:t>Акт сдачи-приемки оказанных услуг № 01-2026 от 03.10.2026 г.</w:t>
+        <w:t>Акт сдачи-приемки оказанных услуг № 01-2026 от 04.10.2026 г.</w:t>
       </w:r>
     </w:p>
     <w:p>
@@ -22,7 +22,7 @@
         <w:t xml:space="preserve">Исполнитель: </w:t>
       </w:r>
       <w:r>
-        <w:t>Федотов Дмитрий, ИНН 772485920194, Плательщик налога на профессиональный доход (Самозанятый)</w:t>
+        <w:t>Федотов Дмитрий, ИНН 731303201073, Плательщик налога на профессиональный доход (Самозанятый)</w:t>
         <w:br/>
       </w:r>
       <w:r>

</xml_diff>

<commit_message>
fix(billing): update Dmitry's official VTB bank account requisites and full name across all documents
</commit_message>
<xml_diff>
--- a/billing/Акт_01-2026_ТД_Автожидкости.docx
+++ b/billing/Акт_01-2026_ТД_Автожидкости.docx
@@ -22,7 +22,7 @@
         <w:t xml:space="preserve">Исполнитель: </w:t>
       </w:r>
       <w:r>
-        <w:t>Федотов Дмитрий, ИНН 731303201073, Плательщик налога на профессиональный доход (Самозанятый)</w:t>
+        <w:t>Федотов Дмитрий Валерьевич, ИНН 731303201073, Плательщик налога на профессиональный доход (Самозанятый)</w:t>
         <w:br/>
       </w:r>
       <w:r>
@@ -271,7 +271,7 @@
         <w:br/>
       </w:r>
       <w:r>
-        <w:t>__________ / Федотов Дмитрий /               __________ / М.П. /</w:t>
+        <w:t>__________ / Федотов Дмитрий Валерьевич /               __________ / М.П. /</w:t>
       </w:r>
     </w:p>
     <w:sectPr>

</xml_diff>